<commit_message>
kubernetes - daemonset & statefulset files updated
</commit_message>
<xml_diff>
--- a/Kubernetes/7-statefulset.docx
+++ b/Kubernetes/7-statefulset.docx
@@ -30910,19 +30910,7 @@
                                 <w:sz w:val="28"/>
                                 <w:szCs w:val="28"/>
                               </w:rPr>
-                              <w:t xml:space="preserve">     </w:t>
-                            </w:r>
-                            <w:r>
-                              <w:rPr>
-                                <w:rFonts w:asciiTheme="majorBidi" w:hAnsiTheme="majorBidi" w:cstheme="majorBidi"/>
-                                <w:b/>
-                                <w:bCs/>
-                                <w:i/>
-                                <w:iCs/>
-                                <w:sz w:val="28"/>
-                                <w:szCs w:val="28"/>
-                              </w:rPr>
-                              <w:t xml:space="preserve">type: </w:t>
+                              <w:t xml:space="preserve">     type: </w:t>
                             </w:r>
                             <w:proofErr w:type="spellStart"/>
                             <w:r>
@@ -31039,19 +31027,7 @@
                           <w:sz w:val="28"/>
                           <w:szCs w:val="28"/>
                         </w:rPr>
-                        <w:t xml:space="preserve">     </w:t>
-                      </w:r>
-                      <w:r>
-                        <w:rPr>
-                          <w:rFonts w:asciiTheme="majorBidi" w:hAnsiTheme="majorBidi" w:cstheme="majorBidi"/>
-                          <w:b/>
-                          <w:bCs/>
-                          <w:i/>
-                          <w:iCs/>
-                          <w:sz w:val="28"/>
-                          <w:szCs w:val="28"/>
-                        </w:rPr>
-                        <w:t xml:space="preserve">type: </w:t>
+                        <w:t xml:space="preserve">     type: </w:t>
                       </w:r>
                       <w:proofErr w:type="spellStart"/>
                       <w:r>
@@ -31352,15 +31328,7 @@
           <w:sz w:val="28"/>
           <w:szCs w:val="28"/>
         </w:rPr>
-        <w:t>S</w:t>
-      </w:r>
-      <w:r>
-        <w:rPr>
-          <w:rFonts w:asciiTheme="majorBidi" w:hAnsiTheme="majorBidi" w:cstheme="majorBidi"/>
-          <w:sz w:val="28"/>
-          <w:szCs w:val="28"/>
-        </w:rPr>
-        <w:t xml:space="preserve">witching from </w:t>
+        <w:t xml:space="preserve">Switching from </w:t>
       </w:r>
       <w:proofErr w:type="spellStart"/>
       <w:r>
@@ -31506,23 +31474,7 @@
           <w:sz w:val="28"/>
           <w:szCs w:val="28"/>
         </w:rPr>
-        <w:t>, Kubernetes does not manage updates automatically. Pods are updated only when you manually delete them.</w:t>
-      </w:r>
-      <w:r>
-        <w:rPr>
-          <w:rFonts w:asciiTheme="majorBidi" w:hAnsiTheme="majorBidi" w:cstheme="majorBidi"/>
-          <w:sz w:val="28"/>
-          <w:szCs w:val="28"/>
-        </w:rPr>
-        <w:t xml:space="preserve"> </w:t>
-      </w:r>
-      <w:r>
-        <w:rPr>
-          <w:rFonts w:asciiTheme="majorBidi" w:hAnsiTheme="majorBidi" w:cstheme="majorBidi"/>
-          <w:sz w:val="28"/>
-          <w:szCs w:val="28"/>
-        </w:rPr>
-        <w:t xml:space="preserve">If you change the strategy to </w:t>
+        <w:t xml:space="preserve">, Kubernetes does not manage updates automatically. Pods are updated only when you manually delete them. If you change the strategy to </w:t>
       </w:r>
       <w:proofErr w:type="spellStart"/>
       <w:r>
@@ -34106,7 +34058,7 @@
   <w:abstractNum w:abstractNumId="18" w15:restartNumberingAfterBreak="0">
     <w:nsid w:val="1B745D8A"/>
     <w:multiLevelType w:val="hybridMultilevel"/>
-    <w:tmpl w:val="A7A86536"/>
+    <w:tmpl w:val="41C6B608"/>
     <w:lvl w:ilvl="0" w:tplc="04090001">
       <w:start w:val="1"/>
       <w:numFmt w:val="bullet"/>
@@ -35748,6 +35700,119 @@
     </w:lvl>
   </w:abstractNum>
   <w:abstractNum w:abstractNumId="33" w15:restartNumberingAfterBreak="0">
+    <w:nsid w:val="30473F85"/>
+    <w:multiLevelType w:val="hybridMultilevel"/>
+    <w:tmpl w:val="3514D052"/>
+    <w:lvl w:ilvl="0" w:tplc="04090001">
+      <w:start w:val="1"/>
+      <w:numFmt w:val="bullet"/>
+      <w:lvlText w:val=""/>
+      <w:lvlJc w:val="left"/>
+      <w:pPr>
+        <w:ind w:left="720" w:hanging="360"/>
+      </w:pPr>
+      <w:rPr>
+        <w:rFonts w:ascii="Symbol" w:hAnsi="Symbol" w:hint="default"/>
+      </w:rPr>
+    </w:lvl>
+    <w:lvl w:ilvl="1" w:tplc="04090003" w:tentative="1">
+      <w:start w:val="1"/>
+      <w:numFmt w:val="bullet"/>
+      <w:lvlText w:val="o"/>
+      <w:lvlJc w:val="left"/>
+      <w:pPr>
+        <w:ind w:left="1440" w:hanging="360"/>
+      </w:pPr>
+      <w:rPr>
+        <w:rFonts w:ascii="Courier New" w:hAnsi="Courier New" w:cs="Courier New" w:hint="default"/>
+      </w:rPr>
+    </w:lvl>
+    <w:lvl w:ilvl="2" w:tplc="04090005" w:tentative="1">
+      <w:start w:val="1"/>
+      <w:numFmt w:val="bullet"/>
+      <w:lvlText w:val=""/>
+      <w:lvlJc w:val="left"/>
+      <w:pPr>
+        <w:ind w:left="2160" w:hanging="360"/>
+      </w:pPr>
+      <w:rPr>
+        <w:rFonts w:ascii="Wingdings" w:hAnsi="Wingdings" w:hint="default"/>
+      </w:rPr>
+    </w:lvl>
+    <w:lvl w:ilvl="3" w:tplc="04090001" w:tentative="1">
+      <w:start w:val="1"/>
+      <w:numFmt w:val="bullet"/>
+      <w:lvlText w:val=""/>
+      <w:lvlJc w:val="left"/>
+      <w:pPr>
+        <w:ind w:left="2880" w:hanging="360"/>
+      </w:pPr>
+      <w:rPr>
+        <w:rFonts w:ascii="Symbol" w:hAnsi="Symbol" w:hint="default"/>
+      </w:rPr>
+    </w:lvl>
+    <w:lvl w:ilvl="4" w:tplc="04090003" w:tentative="1">
+      <w:start w:val="1"/>
+      <w:numFmt w:val="bullet"/>
+      <w:lvlText w:val="o"/>
+      <w:lvlJc w:val="left"/>
+      <w:pPr>
+        <w:ind w:left="3600" w:hanging="360"/>
+      </w:pPr>
+      <w:rPr>
+        <w:rFonts w:ascii="Courier New" w:hAnsi="Courier New" w:cs="Courier New" w:hint="default"/>
+      </w:rPr>
+    </w:lvl>
+    <w:lvl w:ilvl="5" w:tplc="04090005" w:tentative="1">
+      <w:start w:val="1"/>
+      <w:numFmt w:val="bullet"/>
+      <w:lvlText w:val=""/>
+      <w:lvlJc w:val="left"/>
+      <w:pPr>
+        <w:ind w:left="4320" w:hanging="360"/>
+      </w:pPr>
+      <w:rPr>
+        <w:rFonts w:ascii="Wingdings" w:hAnsi="Wingdings" w:hint="default"/>
+      </w:rPr>
+    </w:lvl>
+    <w:lvl w:ilvl="6" w:tplc="04090001" w:tentative="1">
+      <w:start w:val="1"/>
+      <w:numFmt w:val="bullet"/>
+      <w:lvlText w:val=""/>
+      <w:lvlJc w:val="left"/>
+      <w:pPr>
+        <w:ind w:left="5040" w:hanging="360"/>
+      </w:pPr>
+      <w:rPr>
+        <w:rFonts w:ascii="Symbol" w:hAnsi="Symbol" w:hint="default"/>
+      </w:rPr>
+    </w:lvl>
+    <w:lvl w:ilvl="7" w:tplc="04090003" w:tentative="1">
+      <w:start w:val="1"/>
+      <w:numFmt w:val="bullet"/>
+      <w:lvlText w:val="o"/>
+      <w:lvlJc w:val="left"/>
+      <w:pPr>
+        <w:ind w:left="5760" w:hanging="360"/>
+      </w:pPr>
+      <w:rPr>
+        <w:rFonts w:ascii="Courier New" w:hAnsi="Courier New" w:cs="Courier New" w:hint="default"/>
+      </w:rPr>
+    </w:lvl>
+    <w:lvl w:ilvl="8" w:tplc="04090005" w:tentative="1">
+      <w:start w:val="1"/>
+      <w:numFmt w:val="bullet"/>
+      <w:lvlText w:val=""/>
+      <w:lvlJc w:val="left"/>
+      <w:pPr>
+        <w:ind w:left="6480" w:hanging="360"/>
+      </w:pPr>
+      <w:rPr>
+        <w:rFonts w:ascii="Wingdings" w:hAnsi="Wingdings" w:hint="default"/>
+      </w:rPr>
+    </w:lvl>
+  </w:abstractNum>
+  <w:abstractNum w:abstractNumId="34" w15:restartNumberingAfterBreak="0">
     <w:nsid w:val="311E7DC7"/>
     <w:multiLevelType w:val="hybridMultilevel"/>
     <w:tmpl w:val="11D0CBCA"/>
@@ -35860,7 +35925,7 @@
       </w:rPr>
     </w:lvl>
   </w:abstractNum>
-  <w:abstractNum w:abstractNumId="34" w15:restartNumberingAfterBreak="0">
+  <w:abstractNum w:abstractNumId="35" w15:restartNumberingAfterBreak="0">
     <w:nsid w:val="33C720FF"/>
     <w:multiLevelType w:val="hybridMultilevel"/>
     <w:tmpl w:val="FB6AD51C"/>
@@ -35946,7 +36011,7 @@
       </w:pPr>
     </w:lvl>
   </w:abstractNum>
-  <w:abstractNum w:abstractNumId="35" w15:restartNumberingAfterBreak="0">
+  <w:abstractNum w:abstractNumId="36" w15:restartNumberingAfterBreak="0">
     <w:nsid w:val="34C24745"/>
     <w:multiLevelType w:val="hybridMultilevel"/>
     <w:tmpl w:val="7F4C00AC"/>
@@ -36032,7 +36097,7 @@
       </w:pPr>
     </w:lvl>
   </w:abstractNum>
-  <w:abstractNum w:abstractNumId="36" w15:restartNumberingAfterBreak="0">
+  <w:abstractNum w:abstractNumId="37" w15:restartNumberingAfterBreak="0">
     <w:nsid w:val="3534454C"/>
     <w:multiLevelType w:val="hybridMultilevel"/>
     <w:tmpl w:val="5B763AF4"/>
@@ -36145,7 +36210,7 @@
       </w:rPr>
     </w:lvl>
   </w:abstractNum>
-  <w:abstractNum w:abstractNumId="37" w15:restartNumberingAfterBreak="0">
+  <w:abstractNum w:abstractNumId="38" w15:restartNumberingAfterBreak="0">
     <w:nsid w:val="35AD7BDC"/>
     <w:multiLevelType w:val="hybridMultilevel"/>
     <w:tmpl w:val="6BB690F2"/>
@@ -36258,7 +36323,7 @@
       </w:rPr>
     </w:lvl>
   </w:abstractNum>
-  <w:abstractNum w:abstractNumId="38" w15:restartNumberingAfterBreak="0">
+  <w:abstractNum w:abstractNumId="39" w15:restartNumberingAfterBreak="0">
     <w:nsid w:val="38DD4513"/>
     <w:multiLevelType w:val="hybridMultilevel"/>
     <w:tmpl w:val="5BB6D536"/>
@@ -36371,7 +36436,7 @@
       </w:rPr>
     </w:lvl>
   </w:abstractNum>
-  <w:abstractNum w:abstractNumId="39" w15:restartNumberingAfterBreak="0">
+  <w:abstractNum w:abstractNumId="40" w15:restartNumberingAfterBreak="0">
     <w:nsid w:val="3A230095"/>
     <w:multiLevelType w:val="hybridMultilevel"/>
     <w:tmpl w:val="6A42D652"/>
@@ -36484,7 +36549,7 @@
       </w:rPr>
     </w:lvl>
   </w:abstractNum>
-  <w:abstractNum w:abstractNumId="40" w15:restartNumberingAfterBreak="0">
+  <w:abstractNum w:abstractNumId="41" w15:restartNumberingAfterBreak="0">
     <w:nsid w:val="41970DA0"/>
     <w:multiLevelType w:val="hybridMultilevel"/>
     <w:tmpl w:val="D59E946C"/>
@@ -36597,7 +36662,7 @@
       </w:rPr>
     </w:lvl>
   </w:abstractNum>
-  <w:abstractNum w:abstractNumId="41" w15:restartNumberingAfterBreak="0">
+  <w:abstractNum w:abstractNumId="42" w15:restartNumberingAfterBreak="0">
     <w:nsid w:val="42463F96"/>
     <w:multiLevelType w:val="hybridMultilevel"/>
     <w:tmpl w:val="38D6BD6C"/>
@@ -36710,7 +36775,7 @@
       </w:rPr>
     </w:lvl>
   </w:abstractNum>
-  <w:abstractNum w:abstractNumId="42" w15:restartNumberingAfterBreak="0">
+  <w:abstractNum w:abstractNumId="43" w15:restartNumberingAfterBreak="0">
     <w:nsid w:val="425B6F8A"/>
     <w:multiLevelType w:val="hybridMultilevel"/>
     <w:tmpl w:val="8FCC3002"/>
@@ -36823,7 +36888,7 @@
       </w:rPr>
     </w:lvl>
   </w:abstractNum>
-  <w:abstractNum w:abstractNumId="43" w15:restartNumberingAfterBreak="0">
+  <w:abstractNum w:abstractNumId="44" w15:restartNumberingAfterBreak="0">
     <w:nsid w:val="42A505FD"/>
     <w:multiLevelType w:val="hybridMultilevel"/>
     <w:tmpl w:val="E8EAEB5E"/>
@@ -36936,7 +37001,7 @@
       </w:rPr>
     </w:lvl>
   </w:abstractNum>
-  <w:abstractNum w:abstractNumId="44" w15:restartNumberingAfterBreak="0">
+  <w:abstractNum w:abstractNumId="45" w15:restartNumberingAfterBreak="0">
     <w:nsid w:val="43B52752"/>
     <w:multiLevelType w:val="hybridMultilevel"/>
     <w:tmpl w:val="1966D71C"/>
@@ -37049,7 +37114,7 @@
       </w:rPr>
     </w:lvl>
   </w:abstractNum>
-  <w:abstractNum w:abstractNumId="45" w15:restartNumberingAfterBreak="0">
+  <w:abstractNum w:abstractNumId="46" w15:restartNumberingAfterBreak="0">
     <w:nsid w:val="43EB530A"/>
     <w:multiLevelType w:val="hybridMultilevel"/>
     <w:tmpl w:val="F972431E"/>
@@ -37135,7 +37200,7 @@
       </w:pPr>
     </w:lvl>
   </w:abstractNum>
-  <w:abstractNum w:abstractNumId="46" w15:restartNumberingAfterBreak="0">
+  <w:abstractNum w:abstractNumId="47" w15:restartNumberingAfterBreak="0">
     <w:nsid w:val="45AF7C35"/>
     <w:multiLevelType w:val="hybridMultilevel"/>
     <w:tmpl w:val="8772944E"/>
@@ -37248,7 +37313,7 @@
       </w:rPr>
     </w:lvl>
   </w:abstractNum>
-  <w:abstractNum w:abstractNumId="47" w15:restartNumberingAfterBreak="0">
+  <w:abstractNum w:abstractNumId="48" w15:restartNumberingAfterBreak="0">
     <w:nsid w:val="46CC4484"/>
     <w:multiLevelType w:val="hybridMultilevel"/>
     <w:tmpl w:val="7F4C00AC"/>
@@ -37334,7 +37399,7 @@
       </w:pPr>
     </w:lvl>
   </w:abstractNum>
-  <w:abstractNum w:abstractNumId="48" w15:restartNumberingAfterBreak="0">
+  <w:abstractNum w:abstractNumId="49" w15:restartNumberingAfterBreak="0">
     <w:nsid w:val="4A6F36B3"/>
     <w:multiLevelType w:val="hybridMultilevel"/>
     <w:tmpl w:val="65F039F8"/>
@@ -37447,7 +37512,7 @@
       </w:rPr>
     </w:lvl>
   </w:abstractNum>
-  <w:abstractNum w:abstractNumId="49" w15:restartNumberingAfterBreak="0">
+  <w:abstractNum w:abstractNumId="50" w15:restartNumberingAfterBreak="0">
     <w:nsid w:val="4ACB1AC3"/>
     <w:multiLevelType w:val="hybridMultilevel"/>
     <w:tmpl w:val="D44C12BC"/>
@@ -37560,7 +37625,7 @@
       </w:rPr>
     </w:lvl>
   </w:abstractNum>
-  <w:abstractNum w:abstractNumId="50" w15:restartNumberingAfterBreak="0">
+  <w:abstractNum w:abstractNumId="51" w15:restartNumberingAfterBreak="0">
     <w:nsid w:val="4B9262FF"/>
     <w:multiLevelType w:val="hybridMultilevel"/>
     <w:tmpl w:val="1922AF6E"/>
@@ -37646,7 +37711,7 @@
       </w:pPr>
     </w:lvl>
   </w:abstractNum>
-  <w:abstractNum w:abstractNumId="51" w15:restartNumberingAfterBreak="0">
+  <w:abstractNum w:abstractNumId="52" w15:restartNumberingAfterBreak="0">
     <w:nsid w:val="4D016762"/>
     <w:multiLevelType w:val="hybridMultilevel"/>
     <w:tmpl w:val="BCBC0E22"/>
@@ -37759,7 +37824,7 @@
       </w:rPr>
     </w:lvl>
   </w:abstractNum>
-  <w:abstractNum w:abstractNumId="52" w15:restartNumberingAfterBreak="0">
+  <w:abstractNum w:abstractNumId="53" w15:restartNumberingAfterBreak="0">
     <w:nsid w:val="534533F1"/>
     <w:multiLevelType w:val="hybridMultilevel"/>
     <w:tmpl w:val="9D7C3B12"/>
@@ -37848,7 +37913,7 @@
       </w:pPr>
     </w:lvl>
   </w:abstractNum>
-  <w:abstractNum w:abstractNumId="53" w15:restartNumberingAfterBreak="0">
+  <w:abstractNum w:abstractNumId="54" w15:restartNumberingAfterBreak="0">
     <w:nsid w:val="53C56E0C"/>
     <w:multiLevelType w:val="hybridMultilevel"/>
     <w:tmpl w:val="A6F81FF4"/>
@@ -37961,7 +38026,7 @@
       </w:rPr>
     </w:lvl>
   </w:abstractNum>
-  <w:abstractNum w:abstractNumId="54" w15:restartNumberingAfterBreak="0">
+  <w:abstractNum w:abstractNumId="55" w15:restartNumberingAfterBreak="0">
     <w:nsid w:val="53E66AF9"/>
     <w:multiLevelType w:val="hybridMultilevel"/>
     <w:tmpl w:val="31BA1EC6"/>
@@ -38074,7 +38139,7 @@
       </w:rPr>
     </w:lvl>
   </w:abstractNum>
-  <w:abstractNum w:abstractNumId="55" w15:restartNumberingAfterBreak="0">
+  <w:abstractNum w:abstractNumId="56" w15:restartNumberingAfterBreak="0">
     <w:nsid w:val="55C82569"/>
     <w:multiLevelType w:val="hybridMultilevel"/>
     <w:tmpl w:val="E06893B0"/>
@@ -38187,7 +38252,7 @@
       </w:rPr>
     </w:lvl>
   </w:abstractNum>
-  <w:abstractNum w:abstractNumId="56" w15:restartNumberingAfterBreak="0">
+  <w:abstractNum w:abstractNumId="57" w15:restartNumberingAfterBreak="0">
     <w:nsid w:val="592D678C"/>
     <w:multiLevelType w:val="hybridMultilevel"/>
     <w:tmpl w:val="5ABC51DC"/>
@@ -38300,7 +38365,7 @@
       </w:rPr>
     </w:lvl>
   </w:abstractNum>
-  <w:abstractNum w:abstractNumId="57" w15:restartNumberingAfterBreak="0">
+  <w:abstractNum w:abstractNumId="58" w15:restartNumberingAfterBreak="0">
     <w:nsid w:val="5E244B6B"/>
     <w:multiLevelType w:val="hybridMultilevel"/>
     <w:tmpl w:val="8FEA87F8"/>
@@ -38413,7 +38478,7 @@
       </w:rPr>
     </w:lvl>
   </w:abstractNum>
-  <w:abstractNum w:abstractNumId="58" w15:restartNumberingAfterBreak="0">
+  <w:abstractNum w:abstractNumId="59" w15:restartNumberingAfterBreak="0">
     <w:nsid w:val="5F1E4C3F"/>
     <w:multiLevelType w:val="hybridMultilevel"/>
     <w:tmpl w:val="93E2BCEA"/>
@@ -38499,7 +38564,7 @@
       </w:pPr>
     </w:lvl>
   </w:abstractNum>
-  <w:abstractNum w:abstractNumId="59" w15:restartNumberingAfterBreak="0">
+  <w:abstractNum w:abstractNumId="60" w15:restartNumberingAfterBreak="0">
     <w:nsid w:val="5FE2385F"/>
     <w:multiLevelType w:val="hybridMultilevel"/>
     <w:tmpl w:val="A4026CB4"/>
@@ -38612,7 +38677,7 @@
       </w:rPr>
     </w:lvl>
   </w:abstractNum>
-  <w:abstractNum w:abstractNumId="60" w15:restartNumberingAfterBreak="0">
+  <w:abstractNum w:abstractNumId="61" w15:restartNumberingAfterBreak="0">
     <w:nsid w:val="664B1937"/>
     <w:multiLevelType w:val="hybridMultilevel"/>
     <w:tmpl w:val="37BA6348"/>
@@ -38725,7 +38790,7 @@
       </w:rPr>
     </w:lvl>
   </w:abstractNum>
-  <w:abstractNum w:abstractNumId="61" w15:restartNumberingAfterBreak="0">
+  <w:abstractNum w:abstractNumId="62" w15:restartNumberingAfterBreak="0">
     <w:nsid w:val="67FB564F"/>
     <w:multiLevelType w:val="hybridMultilevel"/>
     <w:tmpl w:val="CCCA0BC0"/>
@@ -38838,7 +38903,7 @@
       </w:rPr>
     </w:lvl>
   </w:abstractNum>
-  <w:abstractNum w:abstractNumId="62" w15:restartNumberingAfterBreak="0">
+  <w:abstractNum w:abstractNumId="63" w15:restartNumberingAfterBreak="0">
     <w:nsid w:val="68A01758"/>
     <w:multiLevelType w:val="hybridMultilevel"/>
     <w:tmpl w:val="8FA069E4"/>
@@ -38951,7 +39016,7 @@
       </w:rPr>
     </w:lvl>
   </w:abstractNum>
-  <w:abstractNum w:abstractNumId="63" w15:restartNumberingAfterBreak="0">
+  <w:abstractNum w:abstractNumId="64" w15:restartNumberingAfterBreak="0">
     <w:nsid w:val="6CB52A5F"/>
     <w:multiLevelType w:val="hybridMultilevel"/>
     <w:tmpl w:val="9442358E"/>
@@ -39037,7 +39102,7 @@
       </w:pPr>
     </w:lvl>
   </w:abstractNum>
-  <w:abstractNum w:abstractNumId="64" w15:restartNumberingAfterBreak="0">
+  <w:abstractNum w:abstractNumId="65" w15:restartNumberingAfterBreak="0">
     <w:nsid w:val="6EE45FE1"/>
     <w:multiLevelType w:val="hybridMultilevel"/>
     <w:tmpl w:val="119E271E"/>
@@ -39150,7 +39215,7 @@
       </w:rPr>
     </w:lvl>
   </w:abstractNum>
-  <w:abstractNum w:abstractNumId="65" w15:restartNumberingAfterBreak="0">
+  <w:abstractNum w:abstractNumId="66" w15:restartNumberingAfterBreak="0">
     <w:nsid w:val="71243CF7"/>
     <w:multiLevelType w:val="hybridMultilevel"/>
     <w:tmpl w:val="3AFE8202"/>
@@ -39263,7 +39328,7 @@
       </w:rPr>
     </w:lvl>
   </w:abstractNum>
-  <w:abstractNum w:abstractNumId="66" w15:restartNumberingAfterBreak="0">
+  <w:abstractNum w:abstractNumId="67" w15:restartNumberingAfterBreak="0">
     <w:nsid w:val="71411F68"/>
     <w:multiLevelType w:val="hybridMultilevel"/>
     <w:tmpl w:val="4E9E5BC2"/>
@@ -39376,7 +39441,7 @@
       </w:rPr>
     </w:lvl>
   </w:abstractNum>
-  <w:abstractNum w:abstractNumId="67" w15:restartNumberingAfterBreak="0">
+  <w:abstractNum w:abstractNumId="68" w15:restartNumberingAfterBreak="0">
     <w:nsid w:val="716B58C1"/>
     <w:multiLevelType w:val="hybridMultilevel"/>
     <w:tmpl w:val="47608A00"/>
@@ -39489,7 +39554,120 @@
       </w:rPr>
     </w:lvl>
   </w:abstractNum>
-  <w:abstractNum w:abstractNumId="68" w15:restartNumberingAfterBreak="0">
+  <w:abstractNum w:abstractNumId="69" w15:restartNumberingAfterBreak="0">
+    <w:nsid w:val="7245146A"/>
+    <w:multiLevelType w:val="hybridMultilevel"/>
+    <w:tmpl w:val="A31E63F4"/>
+    <w:lvl w:ilvl="0" w:tplc="04090001">
+      <w:start w:val="1"/>
+      <w:numFmt w:val="bullet"/>
+      <w:lvlText w:val=""/>
+      <w:lvlJc w:val="left"/>
+      <w:pPr>
+        <w:ind w:left="720" w:hanging="360"/>
+      </w:pPr>
+      <w:rPr>
+        <w:rFonts w:ascii="Symbol" w:hAnsi="Symbol" w:hint="default"/>
+      </w:rPr>
+    </w:lvl>
+    <w:lvl w:ilvl="1" w:tplc="04090003" w:tentative="1">
+      <w:start w:val="1"/>
+      <w:numFmt w:val="bullet"/>
+      <w:lvlText w:val="o"/>
+      <w:lvlJc w:val="left"/>
+      <w:pPr>
+        <w:ind w:left="1440" w:hanging="360"/>
+      </w:pPr>
+      <w:rPr>
+        <w:rFonts w:ascii="Courier New" w:hAnsi="Courier New" w:cs="Courier New" w:hint="default"/>
+      </w:rPr>
+    </w:lvl>
+    <w:lvl w:ilvl="2" w:tplc="04090005" w:tentative="1">
+      <w:start w:val="1"/>
+      <w:numFmt w:val="bullet"/>
+      <w:lvlText w:val=""/>
+      <w:lvlJc w:val="left"/>
+      <w:pPr>
+        <w:ind w:left="2160" w:hanging="360"/>
+      </w:pPr>
+      <w:rPr>
+        <w:rFonts w:ascii="Wingdings" w:hAnsi="Wingdings" w:hint="default"/>
+      </w:rPr>
+    </w:lvl>
+    <w:lvl w:ilvl="3" w:tplc="04090001" w:tentative="1">
+      <w:start w:val="1"/>
+      <w:numFmt w:val="bullet"/>
+      <w:lvlText w:val=""/>
+      <w:lvlJc w:val="left"/>
+      <w:pPr>
+        <w:ind w:left="2880" w:hanging="360"/>
+      </w:pPr>
+      <w:rPr>
+        <w:rFonts w:ascii="Symbol" w:hAnsi="Symbol" w:hint="default"/>
+      </w:rPr>
+    </w:lvl>
+    <w:lvl w:ilvl="4" w:tplc="04090003" w:tentative="1">
+      <w:start w:val="1"/>
+      <w:numFmt w:val="bullet"/>
+      <w:lvlText w:val="o"/>
+      <w:lvlJc w:val="left"/>
+      <w:pPr>
+        <w:ind w:left="3600" w:hanging="360"/>
+      </w:pPr>
+      <w:rPr>
+        <w:rFonts w:ascii="Courier New" w:hAnsi="Courier New" w:cs="Courier New" w:hint="default"/>
+      </w:rPr>
+    </w:lvl>
+    <w:lvl w:ilvl="5" w:tplc="04090005" w:tentative="1">
+      <w:start w:val="1"/>
+      <w:numFmt w:val="bullet"/>
+      <w:lvlText w:val=""/>
+      <w:lvlJc w:val="left"/>
+      <w:pPr>
+        <w:ind w:left="4320" w:hanging="360"/>
+      </w:pPr>
+      <w:rPr>
+        <w:rFonts w:ascii="Wingdings" w:hAnsi="Wingdings" w:hint="default"/>
+      </w:rPr>
+    </w:lvl>
+    <w:lvl w:ilvl="6" w:tplc="04090001" w:tentative="1">
+      <w:start w:val="1"/>
+      <w:numFmt w:val="bullet"/>
+      <w:lvlText w:val=""/>
+      <w:lvlJc w:val="left"/>
+      <w:pPr>
+        <w:ind w:left="5040" w:hanging="360"/>
+      </w:pPr>
+      <w:rPr>
+        <w:rFonts w:ascii="Symbol" w:hAnsi="Symbol" w:hint="default"/>
+      </w:rPr>
+    </w:lvl>
+    <w:lvl w:ilvl="7" w:tplc="04090003" w:tentative="1">
+      <w:start w:val="1"/>
+      <w:numFmt w:val="bullet"/>
+      <w:lvlText w:val="o"/>
+      <w:lvlJc w:val="left"/>
+      <w:pPr>
+        <w:ind w:left="5760" w:hanging="360"/>
+      </w:pPr>
+      <w:rPr>
+        <w:rFonts w:ascii="Courier New" w:hAnsi="Courier New" w:cs="Courier New" w:hint="default"/>
+      </w:rPr>
+    </w:lvl>
+    <w:lvl w:ilvl="8" w:tplc="04090005" w:tentative="1">
+      <w:start w:val="1"/>
+      <w:numFmt w:val="bullet"/>
+      <w:lvlText w:val=""/>
+      <w:lvlJc w:val="left"/>
+      <w:pPr>
+        <w:ind w:left="6480" w:hanging="360"/>
+      </w:pPr>
+      <w:rPr>
+        <w:rFonts w:ascii="Wingdings" w:hAnsi="Wingdings" w:hint="default"/>
+      </w:rPr>
+    </w:lvl>
+  </w:abstractNum>
+  <w:abstractNum w:abstractNumId="70" w15:restartNumberingAfterBreak="0">
     <w:nsid w:val="72F8715F"/>
     <w:multiLevelType w:val="hybridMultilevel"/>
     <w:tmpl w:val="437412B0"/>
@@ -39602,7 +39780,7 @@
       </w:rPr>
     </w:lvl>
   </w:abstractNum>
-  <w:abstractNum w:abstractNumId="69" w15:restartNumberingAfterBreak="0">
+  <w:abstractNum w:abstractNumId="71" w15:restartNumberingAfterBreak="0">
     <w:nsid w:val="755B6B56"/>
     <w:multiLevelType w:val="hybridMultilevel"/>
     <w:tmpl w:val="10FCFF62"/>
@@ -39715,7 +39893,7 @@
       </w:rPr>
     </w:lvl>
   </w:abstractNum>
-  <w:abstractNum w:abstractNumId="70" w15:restartNumberingAfterBreak="0">
+  <w:abstractNum w:abstractNumId="72" w15:restartNumberingAfterBreak="0">
     <w:nsid w:val="75D71CBE"/>
     <w:multiLevelType w:val="hybridMultilevel"/>
     <w:tmpl w:val="A3BCEF22"/>
@@ -39801,7 +39979,7 @@
       </w:pPr>
     </w:lvl>
   </w:abstractNum>
-  <w:abstractNum w:abstractNumId="71" w15:restartNumberingAfterBreak="0">
+  <w:abstractNum w:abstractNumId="73" w15:restartNumberingAfterBreak="0">
     <w:nsid w:val="77A83F4A"/>
     <w:multiLevelType w:val="hybridMultilevel"/>
     <w:tmpl w:val="94364C26"/>
@@ -39914,7 +40092,7 @@
       </w:rPr>
     </w:lvl>
   </w:abstractNum>
-  <w:abstractNum w:abstractNumId="72" w15:restartNumberingAfterBreak="0">
+  <w:abstractNum w:abstractNumId="74" w15:restartNumberingAfterBreak="0">
     <w:nsid w:val="77BD5C11"/>
     <w:multiLevelType w:val="hybridMultilevel"/>
     <w:tmpl w:val="0FF0D7C2"/>
@@ -40027,7 +40205,7 @@
       </w:rPr>
     </w:lvl>
   </w:abstractNum>
-  <w:abstractNum w:abstractNumId="73" w15:restartNumberingAfterBreak="0">
+  <w:abstractNum w:abstractNumId="75" w15:restartNumberingAfterBreak="0">
     <w:nsid w:val="79576246"/>
     <w:multiLevelType w:val="hybridMultilevel"/>
     <w:tmpl w:val="A5BE155C"/>
@@ -40140,7 +40318,7 @@
       </w:rPr>
     </w:lvl>
   </w:abstractNum>
-  <w:abstractNum w:abstractNumId="74" w15:restartNumberingAfterBreak="0">
+  <w:abstractNum w:abstractNumId="76" w15:restartNumberingAfterBreak="0">
     <w:nsid w:val="79FD35FA"/>
     <w:multiLevelType w:val="hybridMultilevel"/>
     <w:tmpl w:val="E9AAAC8C"/>
@@ -40253,7 +40431,7 @@
       </w:rPr>
     </w:lvl>
   </w:abstractNum>
-  <w:abstractNum w:abstractNumId="75" w15:restartNumberingAfterBreak="0">
+  <w:abstractNum w:abstractNumId="77" w15:restartNumberingAfterBreak="0">
     <w:nsid w:val="7AC53176"/>
     <w:multiLevelType w:val="hybridMultilevel"/>
     <w:tmpl w:val="881C31AE"/>
@@ -40366,7 +40544,7 @@
       </w:rPr>
     </w:lvl>
   </w:abstractNum>
-  <w:abstractNum w:abstractNumId="76" w15:restartNumberingAfterBreak="0">
+  <w:abstractNum w:abstractNumId="78" w15:restartNumberingAfterBreak="0">
     <w:nsid w:val="7B0B3951"/>
     <w:multiLevelType w:val="hybridMultilevel"/>
     <w:tmpl w:val="44A86E4E"/>
@@ -40452,7 +40630,7 @@
       </w:pPr>
     </w:lvl>
   </w:abstractNum>
-  <w:abstractNum w:abstractNumId="77" w15:restartNumberingAfterBreak="0">
+  <w:abstractNum w:abstractNumId="79" w15:restartNumberingAfterBreak="0">
     <w:nsid w:val="7B205B09"/>
     <w:multiLevelType w:val="hybridMultilevel"/>
     <w:tmpl w:val="7D06D5F8"/>
@@ -40565,7 +40743,7 @@
       </w:rPr>
     </w:lvl>
   </w:abstractNum>
-  <w:abstractNum w:abstractNumId="78" w15:restartNumberingAfterBreak="0">
+  <w:abstractNum w:abstractNumId="80" w15:restartNumberingAfterBreak="0">
     <w:nsid w:val="7CF81BF4"/>
     <w:multiLevelType w:val="hybridMultilevel"/>
     <w:tmpl w:val="2686468E"/>
@@ -40685,7 +40863,7 @@
     <w:abstractNumId w:val="30"/>
   </w:num>
   <w:num w:numId="3" w16cid:durableId="125465519">
-    <w:abstractNumId w:val="56"/>
+    <w:abstractNumId w:val="57"/>
   </w:num>
   <w:num w:numId="4" w16cid:durableId="1258517929">
     <w:abstractNumId w:val="22"/>
@@ -40694,25 +40872,25 @@
     <w:abstractNumId w:val="21"/>
   </w:num>
   <w:num w:numId="6" w16cid:durableId="1926497359">
-    <w:abstractNumId w:val="72"/>
+    <w:abstractNumId w:val="74"/>
   </w:num>
   <w:num w:numId="7" w16cid:durableId="370225748">
-    <w:abstractNumId w:val="41"/>
+    <w:abstractNumId w:val="42"/>
   </w:num>
   <w:num w:numId="8" w16cid:durableId="506598367">
-    <w:abstractNumId w:val="33"/>
+    <w:abstractNumId w:val="34"/>
   </w:num>
   <w:num w:numId="9" w16cid:durableId="1941445215">
-    <w:abstractNumId w:val="62"/>
+    <w:abstractNumId w:val="63"/>
   </w:num>
   <w:num w:numId="10" w16cid:durableId="2071884099">
-    <w:abstractNumId w:val="65"/>
+    <w:abstractNumId w:val="66"/>
   </w:num>
   <w:num w:numId="11" w16cid:durableId="838227339">
-    <w:abstractNumId w:val="44"/>
+    <w:abstractNumId w:val="45"/>
   </w:num>
   <w:num w:numId="12" w16cid:durableId="1464735711">
-    <w:abstractNumId w:val="76"/>
+    <w:abstractNumId w:val="78"/>
   </w:num>
   <w:num w:numId="13" w16cid:durableId="1828550284">
     <w:abstractNumId w:val="20"/>
@@ -40730,40 +40908,40 @@
     <w:abstractNumId w:val="12"/>
   </w:num>
   <w:num w:numId="18" w16cid:durableId="1401756114">
-    <w:abstractNumId w:val="55"/>
+    <w:abstractNumId w:val="56"/>
   </w:num>
   <w:num w:numId="19" w16cid:durableId="1204249645">
-    <w:abstractNumId w:val="51"/>
+    <w:abstractNumId w:val="52"/>
   </w:num>
   <w:num w:numId="20" w16cid:durableId="1258977636">
-    <w:abstractNumId w:val="45"/>
+    <w:abstractNumId w:val="46"/>
   </w:num>
   <w:num w:numId="21" w16cid:durableId="1611013574">
-    <w:abstractNumId w:val="61"/>
+    <w:abstractNumId w:val="62"/>
   </w:num>
   <w:num w:numId="22" w16cid:durableId="1322468771">
-    <w:abstractNumId w:val="43"/>
+    <w:abstractNumId w:val="44"/>
   </w:num>
   <w:num w:numId="23" w16cid:durableId="2029872079">
     <w:abstractNumId w:val="5"/>
   </w:num>
   <w:num w:numId="24" w16cid:durableId="309991640">
-    <w:abstractNumId w:val="53"/>
+    <w:abstractNumId w:val="54"/>
   </w:num>
   <w:num w:numId="25" w16cid:durableId="1969310046">
     <w:abstractNumId w:val="7"/>
   </w:num>
   <w:num w:numId="26" w16cid:durableId="1116409724">
-    <w:abstractNumId w:val="40"/>
+    <w:abstractNumId w:val="41"/>
   </w:num>
   <w:num w:numId="27" w16cid:durableId="322780233">
-    <w:abstractNumId w:val="71"/>
+    <w:abstractNumId w:val="73"/>
   </w:num>
   <w:num w:numId="28" w16cid:durableId="1054349657">
     <w:abstractNumId w:val="27"/>
   </w:num>
   <w:num w:numId="29" w16cid:durableId="552277284">
-    <w:abstractNumId w:val="48"/>
+    <w:abstractNumId w:val="49"/>
   </w:num>
   <w:num w:numId="30" w16cid:durableId="1977484625">
     <w:abstractNumId w:val="24"/>
@@ -40772,13 +40950,13 @@
     <w:abstractNumId w:val="15"/>
   </w:num>
   <w:num w:numId="32" w16cid:durableId="386144493">
-    <w:abstractNumId w:val="69"/>
+    <w:abstractNumId w:val="71"/>
   </w:num>
   <w:num w:numId="33" w16cid:durableId="2132167388">
     <w:abstractNumId w:val="25"/>
   </w:num>
   <w:num w:numId="34" w16cid:durableId="1111781599">
-    <w:abstractNumId w:val="59"/>
+    <w:abstractNumId w:val="60"/>
   </w:num>
   <w:num w:numId="35" w16cid:durableId="668556855">
     <w:abstractNumId w:val="28"/>
@@ -40790,61 +40968,61 @@
     <w:abstractNumId w:val="26"/>
   </w:num>
   <w:num w:numId="38" w16cid:durableId="88744314">
-    <w:abstractNumId w:val="67"/>
+    <w:abstractNumId w:val="68"/>
   </w:num>
   <w:num w:numId="39" w16cid:durableId="2022127337">
-    <w:abstractNumId w:val="50"/>
+    <w:abstractNumId w:val="51"/>
   </w:num>
   <w:num w:numId="40" w16cid:durableId="743453144">
-    <w:abstractNumId w:val="63"/>
+    <w:abstractNumId w:val="64"/>
   </w:num>
   <w:num w:numId="41" w16cid:durableId="589193542">
-    <w:abstractNumId w:val="68"/>
+    <w:abstractNumId w:val="70"/>
   </w:num>
   <w:num w:numId="42" w16cid:durableId="1060985723">
-    <w:abstractNumId w:val="39"/>
+    <w:abstractNumId w:val="40"/>
   </w:num>
   <w:num w:numId="43" w16cid:durableId="1137575752">
     <w:abstractNumId w:val="14"/>
   </w:num>
   <w:num w:numId="44" w16cid:durableId="661202924">
-    <w:abstractNumId w:val="36"/>
+    <w:abstractNumId w:val="37"/>
   </w:num>
   <w:num w:numId="45" w16cid:durableId="1478105328">
-    <w:abstractNumId w:val="54"/>
+    <w:abstractNumId w:val="55"/>
   </w:num>
   <w:num w:numId="46" w16cid:durableId="56251777">
-    <w:abstractNumId w:val="64"/>
+    <w:abstractNumId w:val="65"/>
   </w:num>
   <w:num w:numId="47" w16cid:durableId="743139491">
     <w:abstractNumId w:val="13"/>
   </w:num>
   <w:num w:numId="48" w16cid:durableId="1923681215">
-    <w:abstractNumId w:val="37"/>
+    <w:abstractNumId w:val="38"/>
   </w:num>
   <w:num w:numId="49" w16cid:durableId="1006831611">
-    <w:abstractNumId w:val="57"/>
+    <w:abstractNumId w:val="58"/>
   </w:num>
   <w:num w:numId="50" w16cid:durableId="1446075123">
     <w:abstractNumId w:val="11"/>
   </w:num>
   <w:num w:numId="51" w16cid:durableId="1648896361">
-    <w:abstractNumId w:val="49"/>
+    <w:abstractNumId w:val="50"/>
   </w:num>
   <w:num w:numId="52" w16cid:durableId="1735154766">
-    <w:abstractNumId w:val="58"/>
+    <w:abstractNumId w:val="59"/>
   </w:num>
   <w:num w:numId="53" w16cid:durableId="1289434488">
-    <w:abstractNumId w:val="66"/>
+    <w:abstractNumId w:val="67"/>
   </w:num>
   <w:num w:numId="54" w16cid:durableId="2119369249">
     <w:abstractNumId w:val="2"/>
   </w:num>
   <w:num w:numId="55" w16cid:durableId="195315142">
-    <w:abstractNumId w:val="70"/>
+    <w:abstractNumId w:val="72"/>
   </w:num>
   <w:num w:numId="56" w16cid:durableId="822820533">
-    <w:abstractNumId w:val="60"/>
+    <w:abstractNumId w:val="61"/>
   </w:num>
   <w:num w:numId="57" w16cid:durableId="690423250">
     <w:abstractNumId w:val="29"/>
@@ -40856,7 +41034,7 @@
     <w:abstractNumId w:val="8"/>
   </w:num>
   <w:num w:numId="60" w16cid:durableId="2107846099">
-    <w:abstractNumId w:val="46"/>
+    <w:abstractNumId w:val="47"/>
   </w:num>
   <w:num w:numId="61" w16cid:durableId="509563352">
     <w:abstractNumId w:val="9"/>
@@ -40865,7 +41043,7 @@
     <w:abstractNumId w:val="4"/>
   </w:num>
   <w:num w:numId="63" w16cid:durableId="1345087426">
-    <w:abstractNumId w:val="52"/>
+    <w:abstractNumId w:val="53"/>
   </w:num>
   <w:num w:numId="64" w16cid:durableId="241138712">
     <w:abstractNumId w:val="1"/>
@@ -40874,13 +41052,13 @@
     <w:abstractNumId w:val="32"/>
   </w:num>
   <w:num w:numId="66" w16cid:durableId="861435676">
-    <w:abstractNumId w:val="38"/>
+    <w:abstractNumId w:val="39"/>
   </w:num>
   <w:num w:numId="67" w16cid:durableId="2062056329">
-    <w:abstractNumId w:val="75"/>
+    <w:abstractNumId w:val="77"/>
   </w:num>
   <w:num w:numId="68" w16cid:durableId="865560278">
-    <w:abstractNumId w:val="74"/>
+    <w:abstractNumId w:val="76"/>
   </w:num>
   <w:num w:numId="69" w16cid:durableId="1091781898">
     <w:abstractNumId w:val="18"/>
@@ -40889,31 +41067,37 @@
     <w:abstractNumId w:val="19"/>
   </w:num>
   <w:num w:numId="71" w16cid:durableId="1039164216">
-    <w:abstractNumId w:val="34"/>
+    <w:abstractNumId w:val="35"/>
   </w:num>
   <w:num w:numId="72" w16cid:durableId="1890652973">
-    <w:abstractNumId w:val="47"/>
+    <w:abstractNumId w:val="48"/>
   </w:num>
   <w:num w:numId="73" w16cid:durableId="1698968552">
-    <w:abstractNumId w:val="35"/>
+    <w:abstractNumId w:val="36"/>
   </w:num>
   <w:num w:numId="74" w16cid:durableId="699209915">
-    <w:abstractNumId w:val="77"/>
+    <w:abstractNumId w:val="79"/>
   </w:num>
   <w:num w:numId="75" w16cid:durableId="165485899">
-    <w:abstractNumId w:val="73"/>
+    <w:abstractNumId w:val="75"/>
   </w:num>
   <w:num w:numId="76" w16cid:durableId="1238441598">
     <w:abstractNumId w:val="3"/>
   </w:num>
   <w:num w:numId="77" w16cid:durableId="873469252">
-    <w:abstractNumId w:val="78"/>
+    <w:abstractNumId w:val="80"/>
   </w:num>
   <w:num w:numId="78" w16cid:durableId="881597956">
-    <w:abstractNumId w:val="42"/>
+    <w:abstractNumId w:val="43"/>
   </w:num>
   <w:num w:numId="79" w16cid:durableId="361908075">
     <w:abstractNumId w:val="23"/>
+  </w:num>
+  <w:num w:numId="80" w16cid:durableId="1820222017">
+    <w:abstractNumId w:val="33"/>
+  </w:num>
+  <w:num w:numId="81" w16cid:durableId="1959985714">
+    <w:abstractNumId w:val="69"/>
   </w:num>
 </w:numbering>
 </file>

</xml_diff>